<commit_message>
ejercicio final continuado en casa para repaso
</commit_message>
<xml_diff>
--- a/enunciado_practica_final.docx
+++ b/enunciado_practica_final.docx
@@ -1888,7 +1888,7 @@
           <w:color w:val="1E6B42"/>
           <w:sz w:val="20"/>
         </w:rPr>
-        <w:t xml:space="preserve">    El Excel de Opción B tiene 2 hojas — tendrás que cargar </w:t>
+        <w:t xml:space="preserve">    El Excel de Opción B tiene 2 hojas — </w:t>
       </w:r>
       <w:proofErr w:type="spellStart"/>
       <w:r>
@@ -1898,7 +1898,7 @@
           <w:color w:val="1E6B42"/>
           <w:sz w:val="20"/>
         </w:rPr>
-        <w:t>cada</w:t>
+        <w:t>tendrás</w:t>
       </w:r>
       <w:proofErr w:type="spellEnd"/>
       <w:r>
@@ -1908,7 +1908,7 @@
           <w:color w:val="1E6B42"/>
           <w:sz w:val="20"/>
         </w:rPr>
-        <w:t xml:space="preserve"> </w:t>
+        <w:t xml:space="preserve"> que </w:t>
       </w:r>
       <w:proofErr w:type="spellStart"/>
       <w:r>
@@ -1918,7 +1918,7 @@
           <w:color w:val="1E6B42"/>
           <w:sz w:val="20"/>
         </w:rPr>
-        <w:t>una</w:t>
+        <w:t>cargar</w:t>
       </w:r>
       <w:proofErr w:type="spellEnd"/>
       <w:r>
@@ -1938,7 +1938,7 @@
           <w:color w:val="1E6B42"/>
           <w:sz w:val="20"/>
         </w:rPr>
-        <w:t>por</w:t>
+        <w:t>cada</w:t>
       </w:r>
       <w:proofErr w:type="spellEnd"/>
       <w:r>
@@ -1958,7 +1958,7 @@
           <w:color w:val="1E6B42"/>
           <w:sz w:val="20"/>
         </w:rPr>
-        <w:t>separado</w:t>
+        <w:t>una</w:t>
       </w:r>
       <w:proofErr w:type="spellEnd"/>
       <w:r>
@@ -1968,8 +1968,9 @@
           <w:color w:val="1E6B42"/>
           <w:sz w:val="20"/>
         </w:rPr>
-        <w:t>.</w:t>
-      </w:r>
+        <w:t xml:space="preserve"> </w:t>
+      </w:r>
+      <w:proofErr w:type="spellStart"/>
       <w:r>
         <w:rPr>
           <w:rFonts w:ascii="Calibri" w:hAnsi="Calibri"/>
@@ -1977,10 +1978,58 @@
           <w:color w:val="1E6B42"/>
           <w:sz w:val="20"/>
         </w:rPr>
-        <w:t xml:space="preserve"> HECHO</w:t>
-      </w:r>
-      <w:bookmarkStart w:id="0" w:name="_GoBack"/>
-      <w:bookmarkEnd w:id="0"/>
+        <w:t>por</w:t>
+      </w:r>
+      <w:proofErr w:type="spellEnd"/>
+      <w:r>
+        <w:rPr>
+          <w:rFonts w:ascii="Calibri" w:hAnsi="Calibri"/>
+          <w:i/>
+          <w:color w:val="1E6B42"/>
+          <w:sz w:val="20"/>
+        </w:rPr>
+        <w:t xml:space="preserve"> </w:t>
+      </w:r>
+      <w:proofErr w:type="spellStart"/>
+      <w:r>
+        <w:rPr>
+          <w:rFonts w:ascii="Calibri" w:hAnsi="Calibri"/>
+          <w:i/>
+          <w:color w:val="1E6B42"/>
+          <w:sz w:val="20"/>
+        </w:rPr>
+        <w:t>separado</w:t>
+      </w:r>
+      <w:proofErr w:type="spellEnd"/>
+      <w:r>
+        <w:rPr>
+          <w:rFonts w:ascii="Calibri" w:hAnsi="Calibri"/>
+          <w:i/>
+          <w:color w:val="1E6B42"/>
+          <w:sz w:val="20"/>
+        </w:rPr>
+        <w:t>.</w:t>
+      </w:r>
+      <w:r>
+        <w:rPr>
+          <w:rFonts w:ascii="Calibri" w:hAnsi="Calibri"/>
+          <w:i/>
+          <w:color w:val="1E6B42"/>
+          <w:sz w:val="20"/>
+        </w:rPr>
+        <w:t xml:space="preserve"> </w:t>
+      </w:r>
+      <w:r>
+        <w:rPr>
+          <w:rFonts w:ascii="Calibri" w:hAnsi="Calibri"/>
+          <w:b/>
+          <w:i/>
+          <w:color w:val="FF0000"/>
+          <w:sz w:val="20"/>
+          <w:u w:val="single"/>
+        </w:rPr>
+        <w:t>HECHO</w:t>
+      </w:r>
     </w:p>
     <w:p>
       <w:pPr>
@@ -2715,8 +2764,54 @@
         <w:rPr>
           <w:rFonts w:ascii="Calibri" w:hAnsi="Calibri"/>
         </w:rPr>
-        <w:t>Aplica estas funciones a TODOS los campos de texto de los 4 ficheros.</w:t>
-      </w:r>
+        <w:t xml:space="preserve">Aplica estas funciones a TODOS los campos de texto de </w:t>
+      </w:r>
+      <w:proofErr w:type="spellStart"/>
+      <w:r>
+        <w:rPr>
+          <w:rFonts w:ascii="Calibri" w:hAnsi="Calibri"/>
+        </w:rPr>
+        <w:t>los</w:t>
+      </w:r>
+      <w:proofErr w:type="spellEnd"/>
+      <w:r>
+        <w:rPr>
+          <w:rFonts w:ascii="Calibri" w:hAnsi="Calibri"/>
+        </w:rPr>
+        <w:t xml:space="preserve"> 4 </w:t>
+      </w:r>
+      <w:proofErr w:type="spellStart"/>
+      <w:r>
+        <w:rPr>
+          <w:rFonts w:ascii="Calibri" w:hAnsi="Calibri"/>
+        </w:rPr>
+        <w:t>ficheros</w:t>
+      </w:r>
+      <w:proofErr w:type="spellEnd"/>
+      <w:r>
+        <w:rPr>
+          <w:rFonts w:ascii="Calibri" w:hAnsi="Calibri"/>
+        </w:rPr>
+        <w:t>.</w:t>
+      </w:r>
+      <w:r>
+        <w:rPr>
+          <w:rFonts w:ascii="Calibri" w:hAnsi="Calibri"/>
+        </w:rPr>
+        <w:t xml:space="preserve"> </w:t>
+      </w:r>
+      <w:bookmarkStart w:id="0" w:name="_GoBack"/>
+      <w:r>
+        <w:rPr>
+          <w:rFonts w:ascii="Calibri" w:hAnsi="Calibri"/>
+          <w:b/>
+          <w:i/>
+          <w:color w:val="FF0000"/>
+          <w:u w:val="single"/>
+        </w:rPr>
+        <w:t>HECHO</w:t>
+      </w:r>
+      <w:bookmarkEnd w:id="0"/>
     </w:p>
     <w:p>
       <w:pPr>
@@ -2934,7 +3029,45 @@
           <w:color w:val="1E6B42"/>
           <w:sz w:val="20"/>
         </w:rPr>
-        <w:t xml:space="preserve">    Para eliminar espacios dobles: usa un bucle while '  ' in texto: texto = texto.replace('  ', ' ')</w:t>
+        <w:t xml:space="preserve">    Para eliminar espaci</w:t>
+      </w:r>
+      <w:r>
+        <w:rPr>
+          <w:rFonts w:ascii="Calibri" w:hAnsi="Calibri"/>
+          <w:i/>
+          <w:color w:val="1E6B42"/>
+          <w:sz w:val="20"/>
+        </w:rPr>
+        <w:t xml:space="preserve">os dobles: usa un bucle while </w:t>
+      </w:r>
+      <w:proofErr w:type="gramStart"/>
+      <w:r>
+        <w:rPr>
+          <w:rFonts w:ascii="Calibri" w:hAnsi="Calibri"/>
+          <w:i/>
+          <w:color w:val="1E6B42"/>
+          <w:sz w:val="20"/>
+        </w:rPr>
+        <w:t xml:space="preserve">' </w:t>
+      </w:r>
+      <w:r>
+        <w:rPr>
+          <w:rFonts w:ascii="Calibri" w:hAnsi="Calibri"/>
+          <w:i/>
+          <w:color w:val="1E6B42"/>
+          <w:sz w:val="20"/>
+        </w:rPr>
+        <w:t xml:space="preserve"> '</w:t>
+      </w:r>
+      <w:proofErr w:type="gramEnd"/>
+      <w:r>
+        <w:rPr>
+          <w:rFonts w:ascii="Calibri" w:hAnsi="Calibri"/>
+          <w:i/>
+          <w:color w:val="1E6B42"/>
+          <w:sz w:val="20"/>
+        </w:rPr>
+        <w:t xml:space="preserve"> in texto: texto = texto.replace('  ', ' ')</w:t>
       </w:r>
     </w:p>
     <w:p>
@@ -7705,7 +7838,7 @@
   <w:abstractNum w:abstractNumId="7" w15:restartNumberingAfterBreak="0">
     <w:nsid w:val="FFFFFF88"/>
     <w:multiLevelType w:val="singleLevel"/>
-    <w:tmpl w:val="B2BA283C"/>
+    <w:tmpl w:val="FCB2D2F0"/>
     <w:lvl w:ilvl="0">
       <w:start w:val="1"/>
       <w:numFmt w:val="decimal"/>
@@ -7723,7 +7856,7 @@
   <w:abstractNum w:abstractNumId="8" w15:restartNumberingAfterBreak="0">
     <w:nsid w:val="FFFFFF89"/>
     <w:multiLevelType w:val="singleLevel"/>
-    <w:tmpl w:val="0080A7E6"/>
+    <w:tmpl w:val="7D1E7CEC"/>
     <w:lvl w:ilvl="0">
       <w:start w:val="1"/>
       <w:numFmt w:val="bullet"/>
@@ -19474,7 +19607,7 @@
 </file>
 
 <file path=customXml/itemProps1.xml><?xml version="1.0" encoding="utf-8"?>
-<ds:datastoreItem xmlns:ds="http://schemas.openxmlformats.org/officeDocument/2006/customXml" ds:itemID="{CA90682C-9891-4567-A12B-4402348D5DEB}">
+<ds:datastoreItem xmlns:ds="http://schemas.openxmlformats.org/officeDocument/2006/customXml" ds:itemID="{A946C0E3-45A4-4DA1-832B-B1B8A7EA7749}">
   <ds:schemaRefs>
     <ds:schemaRef ds:uri="http://schemas.openxmlformats.org/officeDocument/2006/bibliography"/>
   </ds:schemaRefs>

</xml_diff>